<commit_message>
Add alembic migration for employees table and DB setup plus API volumes
</commit_message>
<xml_diff>
--- a/docs/cms/ERP System HRIS - Main Module.docx
+++ b/docs/cms/ERP System HRIS - Main Module.docx
@@ -7,7 +7,7 @@
         <w:pStyle w:val="Heading1"/>
       </w:pPr>
       <w:r>
-        <w:t xml:space="preserve"> HRIS System Documentation</w:t>
+        <w:t>HRIS System Documentation</w:t>
       </w:r>
     </w:p>
     <w:p>
@@ -167,7 +167,7 @@
     <w:p>
       <w:r>
         <w:pict w14:anchorId="5678AD6B">
-          <v:rect id="_x0000_i2234" style="width:0;height:1.5pt" o:hralign="center" o:hrstd="t" o:hr="t" fillcolor="#a0a0a0" stroked="f"/>
+          <v:rect id="_x0000_i1025" style="width:0;height:1.5pt" o:hralign="center" o:hrstd="t" o:hr="t" fillcolor="#a0a0a0" stroked="f"/>
         </w:pict>
       </w:r>
     </w:p>
@@ -252,7 +252,7 @@
     <w:p>
       <w:r>
         <w:pict w14:anchorId="6EA1D170">
-          <v:rect id="_x0000_i2235" style="width:0;height:1.5pt" o:hralign="center" o:hrstd="t" o:hr="t" fillcolor="#a0a0a0" stroked="f"/>
+          <v:rect id="_x0000_i1026" style="width:0;height:1.5pt" o:hralign="center" o:hrstd="t" o:hr="t" fillcolor="#a0a0a0" stroked="f"/>
         </w:pict>
       </w:r>
     </w:p>
@@ -323,7 +323,7 @@
     <w:p>
       <w:r>
         <w:pict w14:anchorId="50ECA149">
-          <v:rect id="_x0000_i2236" style="width:0;height:1.5pt" o:hralign="center" o:hrstd="t" o:hr="t" fillcolor="#a0a0a0" stroked="f"/>
+          <v:rect id="_x0000_i1027" style="width:0;height:1.5pt" o:hralign="center" o:hrstd="t" o:hr="t" fillcolor="#a0a0a0" stroked="f"/>
         </w:pict>
       </w:r>
     </w:p>
@@ -419,7 +419,7 @@
     <w:p>
       <w:r>
         <w:pict w14:anchorId="20F44111">
-          <v:rect id="_x0000_i2237" style="width:0;height:1.5pt" o:hralign="center" o:hrstd="t" o:hr="t" fillcolor="#a0a0a0" stroked="f"/>
+          <v:rect id="_x0000_i1028" style="width:0;height:1.5pt" o:hralign="center" o:hrstd="t" o:hr="t" fillcolor="#a0a0a0" stroked="f"/>
         </w:pict>
       </w:r>
     </w:p>
@@ -565,7 +565,7 @@
     <w:p>
       <w:r>
         <w:pict w14:anchorId="5570F0F5">
-          <v:rect id="_x0000_i2238" style="width:0;height:1.5pt" o:hralign="center" o:hrstd="t" o:hr="t" fillcolor="#a0a0a0" stroked="f"/>
+          <v:rect id="_x0000_i1029" style="width:0;height:1.5pt" o:hralign="center" o:hrstd="t" o:hr="t" fillcolor="#a0a0a0" stroked="f"/>
         </w:pict>
       </w:r>
     </w:p>
@@ -667,7 +667,7 @@
     <w:p>
       <w:r>
         <w:pict w14:anchorId="68D8C14A">
-          <v:rect id="_x0000_i2239" style="width:0;height:1.5pt" o:hralign="center" o:hrstd="t" o:hr="t" fillcolor="#a0a0a0" stroked="f"/>
+          <v:rect id="_x0000_i1030" style="width:0;height:1.5pt" o:hralign="center" o:hrstd="t" o:hr="t" fillcolor="#a0a0a0" stroked="f"/>
         </w:pict>
       </w:r>
     </w:p>
@@ -743,7 +743,7 @@
     <w:p>
       <w:r>
         <w:pict w14:anchorId="5E7C2F5D">
-          <v:rect id="_x0000_i2240" style="width:0;height:1.5pt" o:hralign="center" o:hrstd="t" o:hr="t" fillcolor="#a0a0a0" stroked="f"/>
+          <v:rect id="_x0000_i1031" style="width:0;height:1.5pt" o:hralign="center" o:hrstd="t" o:hr="t" fillcolor="#a0a0a0" stroked="f"/>
         </w:pict>
       </w:r>
     </w:p>
@@ -792,7 +792,7 @@
     <w:p>
       <w:r>
         <w:pict w14:anchorId="5D31E9CF">
-          <v:rect id="_x0000_i2241" style="width:0;height:1.5pt" o:hralign="center" o:hrstd="t" o:hr="t" fillcolor="#a0a0a0" stroked="f"/>
+          <v:rect id="_x0000_i1032" style="width:0;height:1.5pt" o:hralign="center" o:hrstd="t" o:hr="t" fillcolor="#a0a0a0" stroked="f"/>
         </w:pict>
       </w:r>
     </w:p>
@@ -902,7 +902,7 @@
     <w:p>
       <w:r>
         <w:pict w14:anchorId="5EE3A109">
-          <v:rect id="_x0000_i2242" style="width:0;height:1.5pt" o:hralign="center" o:hrstd="t" o:hr="t" fillcolor="#a0a0a0" stroked="f"/>
+          <v:rect id="_x0000_i1033" style="width:0;height:1.5pt" o:hralign="center" o:hrstd="t" o:hr="t" fillcolor="#a0a0a0" stroked="f"/>
         </w:pict>
       </w:r>
     </w:p>
@@ -937,7 +937,7 @@
     <w:p>
       <w:r>
         <w:pict w14:anchorId="5DA5B341">
-          <v:rect id="_x0000_i2243" style="width:0;height:1.5pt" o:hralign="center" o:hrstd="t" o:hr="t" fillcolor="#a0a0a0" stroked="f"/>
+          <v:rect id="_x0000_i1034" style="width:0;height:1.5pt" o:hralign="center" o:hrstd="t" o:hr="t" fillcolor="#a0a0a0" stroked="f"/>
         </w:pict>
       </w:r>
     </w:p>
@@ -1002,7 +1002,7 @@
     <w:p>
       <w:r>
         <w:pict w14:anchorId="38DAAE6A">
-          <v:rect id="_x0000_i2244" style="width:0;height:1.5pt" o:hralign="center" o:hrstd="t" o:hr="t" fillcolor="#a0a0a0" stroked="f"/>
+          <v:rect id="_x0000_i1035" style="width:0;height:1.5pt" o:hralign="center" o:hrstd="t" o:hr="t" fillcolor="#a0a0a0" stroked="f"/>
         </w:pict>
       </w:r>
     </w:p>
@@ -1062,7 +1062,7 @@
     <w:p>
       <w:r>
         <w:pict w14:anchorId="3861DE44">
-          <v:rect id="_x0000_i2245" style="width:0;height:1.5pt" o:hralign="center" o:hrstd="t" o:hr="t" fillcolor="#a0a0a0" stroked="f"/>
+          <v:rect id="_x0000_i1036" style="width:0;height:1.5pt" o:hralign="center" o:hrstd="t" o:hr="t" fillcolor="#a0a0a0" stroked="f"/>
         </w:pict>
       </w:r>
     </w:p>
@@ -1127,7 +1127,7 @@
     <w:p>
       <w:r>
         <w:pict w14:anchorId="1D98B4AA">
-          <v:rect id="_x0000_i2246" style="width:0;height:1.5pt" o:hralign="center" o:hrstd="t" o:hr="t" fillcolor="#a0a0a0" stroked="f"/>
+          <v:rect id="_x0000_i1037" style="width:0;height:1.5pt" o:hralign="center" o:hrstd="t" o:hr="t" fillcolor="#a0a0a0" stroked="f"/>
         </w:pict>
       </w:r>
     </w:p>
@@ -1192,7 +1192,7 @@
     <w:p>
       <w:r>
         <w:pict w14:anchorId="0657AF0F">
-          <v:rect id="_x0000_i2247" style="width:0;height:1.5pt" o:hralign="center" o:hrstd="t" o:hr="t" fillcolor="#a0a0a0" stroked="f"/>
+          <v:rect id="_x0000_i1038" style="width:0;height:1.5pt" o:hralign="center" o:hrstd="t" o:hr="t" fillcolor="#a0a0a0" stroked="f"/>
         </w:pict>
       </w:r>
     </w:p>
@@ -1219,7 +1219,7 @@
     <w:p>
       <w:r>
         <w:pict w14:anchorId="6CE388FF">
-          <v:rect id="_x0000_i2248" style="width:0;height:1.5pt" o:hralign="center" o:hrstd="t" o:hr="t" fillcolor="#a0a0a0" stroked="f"/>
+          <v:rect id="_x0000_i1039" style="width:0;height:1.5pt" o:hralign="center" o:hrstd="t" o:hr="t" fillcolor="#a0a0a0" stroked="f"/>
         </w:pict>
       </w:r>
     </w:p>
@@ -1246,7 +1246,7 @@
     <w:p>
       <w:r>
         <w:pict w14:anchorId="700B8177">
-          <v:rect id="_x0000_i2249" style="width:0;height:1.5pt" o:hralign="center" o:hrstd="t" o:hr="t" fillcolor="#a0a0a0" stroked="f"/>
+          <v:rect id="_x0000_i1040" style="width:0;height:1.5pt" o:hralign="center" o:hrstd="t" o:hr="t" fillcolor="#a0a0a0" stroked="f"/>
         </w:pict>
       </w:r>
     </w:p>
@@ -1288,7 +1288,7 @@
     <w:p>
       <w:r>
         <w:pict w14:anchorId="0472A28D">
-          <v:rect id="_x0000_i2250" style="width:0;height:1.5pt" o:hralign="center" o:hrstd="t" o:hr="t" fillcolor="#a0a0a0" stroked="f"/>
+          <v:rect id="_x0000_i1041" style="width:0;height:1.5pt" o:hralign="center" o:hrstd="t" o:hr="t" fillcolor="#a0a0a0" stroked="f"/>
         </w:pict>
       </w:r>
     </w:p>
@@ -1315,7 +1315,7 @@
     <w:p>
       <w:r>
         <w:pict w14:anchorId="3CD2B97D">
-          <v:rect id="_x0000_i2251" style="width:0;height:1.5pt" o:hralign="center" o:hrstd="t" o:hr="t" fillcolor="#a0a0a0" stroked="f"/>
+          <v:rect id="_x0000_i1042" style="width:0;height:1.5pt" o:hralign="center" o:hrstd="t" o:hr="t" fillcolor="#a0a0a0" stroked="f"/>
         </w:pict>
       </w:r>
     </w:p>
@@ -1365,7 +1365,7 @@
     <w:p>
       <w:r>
         <w:pict w14:anchorId="7B22C813">
-          <v:rect id="_x0000_i2252" style="width:0;height:1.5pt" o:hralign="center" o:hrstd="t" o:hr="t" fillcolor="#a0a0a0" stroked="f"/>
+          <v:rect id="_x0000_i1043" style="width:0;height:1.5pt" o:hralign="center" o:hrstd="t" o:hr="t" fillcolor="#a0a0a0" stroked="f"/>
         </w:pict>
       </w:r>
     </w:p>
@@ -1392,7 +1392,7 @@
     <w:p>
       <w:r>
         <w:pict w14:anchorId="00626EAD">
-          <v:rect id="_x0000_i2253" style="width:0;height:1.5pt" o:hralign="center" o:hrstd="t" o:hr="t" fillcolor="#a0a0a0" stroked="f"/>
+          <v:rect id="_x0000_i1044" style="width:0;height:1.5pt" o:hralign="center" o:hrstd="t" o:hr="t" fillcolor="#a0a0a0" stroked="f"/>
         </w:pict>
       </w:r>
     </w:p>
@@ -1545,7 +1545,7 @@
     <w:p>
       <w:r>
         <w:pict w14:anchorId="5B3C9A5E">
-          <v:rect id="_x0000_i2254" style="width:0;height:1.5pt" o:hralign="center" o:hrstd="t" o:hr="t" fillcolor="#a0a0a0" stroked="f"/>
+          <v:rect id="_x0000_i1045" style="width:0;height:1.5pt" o:hralign="center" o:hrstd="t" o:hr="t" fillcolor="#a0a0a0" stroked="f"/>
         </w:pict>
       </w:r>
     </w:p>
@@ -1595,7 +1595,7 @@
     <w:p>
       <w:r>
         <w:pict w14:anchorId="3EFAF8D8">
-          <v:rect id="_x0000_i2255" style="width:0;height:1.5pt" o:hralign="center" o:hrstd="t" o:hr="t" fillcolor="#a0a0a0" stroked="f"/>
+          <v:rect id="_x0000_i1046" style="width:0;height:1.5pt" o:hralign="center" o:hrstd="t" o:hr="t" fillcolor="#a0a0a0" stroked="f"/>
         </w:pict>
       </w:r>
     </w:p>
@@ -1622,7 +1622,7 @@
     <w:p>
       <w:r>
         <w:pict w14:anchorId="3D293F86">
-          <v:rect id="_x0000_i2256" style="width:0;height:1.5pt" o:hralign="center" o:hrstd="t" o:hr="t" fillcolor="#a0a0a0" stroked="f"/>
+          <v:rect id="_x0000_i1047" style="width:0;height:1.5pt" o:hralign="center" o:hrstd="t" o:hr="t" fillcolor="#a0a0a0" stroked="f"/>
         </w:pict>
       </w:r>
     </w:p>
@@ -1650,7 +1650,7 @@
     <w:p>
       <w:r>
         <w:pict w14:anchorId="7276D556">
-          <v:rect id="_x0000_i2257" style="width:0;height:1.5pt" o:hralign="center" o:hrstd="t" o:hr="t" fillcolor="#a0a0a0" stroked="f"/>
+          <v:rect id="_x0000_i1048" style="width:0;height:1.5pt" o:hralign="center" o:hrstd="t" o:hr="t" fillcolor="#a0a0a0" stroked="f"/>
         </w:pict>
       </w:r>
     </w:p>
@@ -1710,7 +1710,7 @@
     <w:p>
       <w:r>
         <w:pict w14:anchorId="53E34664">
-          <v:rect id="_x0000_i2258" style="width:0;height:1.5pt" o:hralign="center" o:hrstd="t" o:hr="t" fillcolor="#a0a0a0" stroked="f"/>
+          <v:rect id="_x0000_i1049" style="width:0;height:1.5pt" o:hralign="center" o:hrstd="t" o:hr="t" fillcolor="#a0a0a0" stroked="f"/>
         </w:pict>
       </w:r>
     </w:p>
@@ -1803,7 +1803,7 @@
     <w:p>
       <w:r>
         <w:pict w14:anchorId="511057CC">
-          <v:rect id="_x0000_i2259" style="width:0;height:1.5pt" o:hralign="center" o:hrstd="t" o:hr="t" fillcolor="#a0a0a0" stroked="f"/>
+          <v:rect id="_x0000_i1050" style="width:0;height:1.5pt" o:hralign="center" o:hrstd="t" o:hr="t" fillcolor="#a0a0a0" stroked="f"/>
         </w:pict>
       </w:r>
     </w:p>
@@ -17202,6 +17202,7 @@
   <w:style w:type="character" w:default="1" w:styleId="DefaultParagraphFont">
     <w:name w:val="Default Paragraph Font"/>
     <w:uiPriority w:val="1"/>
+    <w:semiHidden/>
     <w:unhideWhenUsed/>
   </w:style>
   <w:style w:type="table" w:default="1" w:styleId="TableNormal">

</xml_diff>